<commit_message>
Add abstract, make minor fixes, #5
</commit_message>
<xml_diff>
--- a/law-firms-names/journal-article/reference.docx
+++ b/law-firms-names/journal-article/reference.docx
@@ -130,7 +130,7 @@
       </w:r>
       <w:r>
         <w:rPr>
-          <w:rFonts w:eastAsia="" w:cs="" w:ascii="Segoe UI Semilight" w:hAnsi="Segoe UI Semilight" w:cstheme="majorBidi" w:eastAsiaTheme="majorEastAsia"/>
+          <w:rFonts w:eastAsia="" w:cs="" w:cstheme="majorBidi" w:eastAsiaTheme="majorEastAsia"/>
           <w:b w:val="false"/>
           <w:bCs/>
           <w:i/>
@@ -759,7 +759,7 @@
       <w:rFonts w:ascii="Segoe UI Semilight" w:hAnsi="Segoe UI Semilight" w:eastAsia="" w:cs="" w:cstheme="majorBidi" w:eastAsiaTheme="majorEastAsia"/>
       <w:b w:val="false"/>
       <w:bCs/>
-      <w:color w:val="4F81BD" w:themeColor="accent1"/>
+      <w:color w:val="000000"/>
       <w:sz w:val="20"/>
       <w:szCs w:val="24"/>
     </w:rPr>

</xml_diff>

<commit_message>
Various minor improvements in paper text, code,  style, and refs, #5
</commit_message>
<xml_diff>
--- a/law-firms-names/journal-article/reference.docx
+++ b/law-firms-names/journal-article/reference.docx
@@ -727,7 +727,7 @@
     <w:pPr>
       <w:keepNext w:val="true"/>
       <w:keepLines/>
-      <w:spacing w:before="238" w:after="0"/>
+      <w:spacing w:before="238" w:after="40"/>
       <w:jc w:val="left"/>
       <w:outlineLvl w:val="1"/>
     </w:pPr>
@@ -751,7 +751,7 @@
     <w:pPr>
       <w:keepNext w:val="true"/>
       <w:keepLines/>
-      <w:spacing w:before="198" w:after="0"/>
+      <w:spacing w:before="238" w:after="40"/>
       <w:jc w:val="left"/>
       <w:outlineLvl w:val="2"/>
     </w:pPr>
@@ -1255,7 +1255,7 @@
     <w:basedOn w:val="Style15"/>
     <w:qFormat/>
     <w:pPr>
-      <w:spacing w:before="119" w:after="119"/>
+      <w:spacing w:before="119" w:after="181"/>
       <w:jc w:val="center"/>
     </w:pPr>
     <w:rPr>
@@ -1352,7 +1352,7 @@
     <w:basedOn w:val="Normal"/>
     <w:qFormat/>
     <w:pPr>
-      <w:spacing w:before="181" w:after="0"/>
+      <w:spacing w:before="181" w:after="181"/>
       <w:jc w:val="left"/>
     </w:pPr>
     <w:rPr>

</xml_diff>